<commit_message>
Add screenshot evidence to laboratory report
</commit_message>
<xml_diff>
--- a/report/laboratory_report.docx
+++ b/report/laboratory_report.docx
@@ -1232,6 +1232,102 @@
       </w:pPr>
       <w:r>
         <w:t xml:space="preserve">5. Enter invalid Python and click Check Code to show that errors are handled without crashing.</w:t>
+      </w:r>
+    </w:p>
+    <w:p>
+      <w:pPr>
+        <w:pStyle w:val="Heading1"/>
+      </w:pPr>
+      <w:r>
+        <w:t xml:space="preserve">Demonstration Evidence</w:t>
+      </w:r>
+    </w:p>
+    <w:p>
+      <w:pPr>
+        <w:pStyle w:val="Normal"/>
+      </w:pPr>
+      <w:r>
+        <w:t xml:space="preserve">The following screenshots document the two adaptive user-model demonstrations. The filenames are preserved from the workspace evidence folder.</w:t>
+      </w:r>
+    </w:p>
+    <w:p>
+      <w:pPr>
+        <w:pStyle w:val="Heading2"/>
+      </w:pPr>
+      <w:r>
+        <w:t xml:space="preserve">Guided Builder</w:t>
+      </w:r>
+    </w:p>
+    <w:p>
+      <w:pPr>
+        <w:pStyle w:val="Normal"/>
+      </w:pPr>
+      <w:r>
+        <w:t xml:space="preserve">The Guided Builder evidence shows the beginner-oriented profile, the profile-specific workspace, and a successful controlled run.</w:t>
+      </w:r>
+    </w:p>
+    <w:p>
+      <w:pPr>
+        <w:pStyle w:val="Normal"/>
+      </w:pPr>
+      <w:r>
+        <w:t xml:space="preserve">![Beginner Guided Builder profile](../screenshots/Beginner%20Guided%20Builder%20profile.jpg)</w:t>
+      </w:r>
+    </w:p>
+    <w:p>
+      <w:pPr>
+        <w:pStyle w:val="Normal"/>
+      </w:pPr>
+      <w:r>
+        <w:t xml:space="preserve">![Beginner Guided Builder profile with run result](../screenshots/Beginner%20Guided%20Builder%20profile%202.jpg)</w:t>
+      </w:r>
+    </w:p>
+    <w:p>
+      <w:pPr>
+        <w:pStyle w:val="Normal"/>
+      </w:pPr>
+      <w:r>
+        <w:t xml:space="preserve">![Beginner Guided Builder controlled run](../screenshots/Beginner%20Guided%20Builder%20profile%20run%20code.jpg)</w:t>
+      </w:r>
+    </w:p>
+    <w:p>
+      <w:pPr>
+        <w:pStyle w:val="Heading2"/>
+      </w:pPr>
+      <w:r>
+        <w:t xml:space="preserve">Independent Builder</w:t>
+      </w:r>
+    </w:p>
+    <w:p>
+      <w:pPr>
+        <w:pStyle w:val="Normal"/>
+      </w:pPr>
+      <w:r>
+        <w:t xml:space="preserve">The Independent Builder evidence shows the advanced, lower-assistance profile and its controlled run behavior.</w:t>
+      </w:r>
+    </w:p>
+    <w:p>
+      <w:pPr>
+        <w:pStyle w:val="Normal"/>
+      </w:pPr>
+      <w:r>
+        <w:t xml:space="preserve">![Advanced Independent Builder profile](../screenshots/advanced%20independent%20builder%20.jpg)</w:t>
+      </w:r>
+    </w:p>
+    <w:p>
+      <w:pPr>
+        <w:pStyle w:val="Normal"/>
+      </w:pPr>
+      <w:r>
+        <w:t xml:space="preserve">![Advanced Independent Builder profile with run result](../screenshots/advanced%20independent%20builder%202.jpg)</w:t>
+      </w:r>
+    </w:p>
+    <w:p>
+      <w:pPr>
+        <w:pStyle w:val="Normal"/>
+      </w:pPr>
+      <w:r>
+        <w:t xml:space="preserve">![Advanced Independent Builder controlled run](../screenshots/advanced%20independent%20builder%20run%20code.jpg)</w:t>
       </w:r>
     </w:p>
     <w:p>

</xml_diff>

<commit_message>
Fix advanced screenshot report links
</commit_message>
<xml_diff>
--- a/report/laboratory_report.docx
+++ b/report/laboratory_report.docx
@@ -1319,15 +1319,15 @@
         <w:pStyle w:val="Normal"/>
       </w:pPr>
       <w:r>
-        <w:t xml:space="preserve">![Advanced Independent Builder profile with run result](../screenshots/advanced%20independent%20builder%202.jpg)</w:t>
-      </w:r>
-    </w:p>
-    <w:p>
-      <w:pPr>
-        <w:pStyle w:val="Normal"/>
-      </w:pPr>
-      <w:r>
-        <w:t xml:space="preserve">![Advanced Independent Builder controlled run](../screenshots/advanced%20independent%20builder%20run%20code.jpg)</w:t>
+        <w:t xml:space="preserve">![Advanced Independent Builder profile with run result](../screenshots/advanced%20independent%20builder%20%202.jpg)</w:t>
+      </w:r>
+    </w:p>
+    <w:p>
+      <w:pPr>
+        <w:pStyle w:val="Normal"/>
+      </w:pPr>
+      <w:r>
+        <w:t xml:space="preserve">![Advanced Independent Builder controlled run](../screenshots/advanced%20independent%20builder%20%20run%20code.jpg)</w:t>
       </w:r>
     </w:p>
     <w:p>

</xml_diff>